<commit_message>
Some changes during the course
</commit_message>
<xml_diff>
--- a/2-Dockers/2-Dockerizing a Node app Using DockerFile.docx
+++ b/2-Dockers/2-Dockerizing a Node app Using DockerFile.docx
@@ -208,6 +208,7 @@
       <w:r>
         <w:t xml:space="preserve">create a file called </w:t>
       </w:r>
+      <w:proofErr w:type="spellStart"/>
       <w:r>
         <w:rPr>
           <w:b/>
@@ -215,19 +216,38 @@
         </w:rPr>
         <w:t>package.json</w:t>
       </w:r>
+      <w:proofErr w:type="spellEnd"/>
       <w:r>
         <w:t xml:space="preserve"> </w:t>
       </w:r>
       <w:r>
         <w:t xml:space="preserve">(using the </w:t>
       </w:r>
-      <w:r>
-        <w:rPr>
-          <w:b/>
-          <w:bCs/>
-        </w:rPr>
-        <w:t>npm init</w:t>
-      </w:r>
+      <w:proofErr w:type="spellStart"/>
+      <w:r>
+        <w:rPr>
+          <w:b/>
+          <w:bCs/>
+        </w:rPr>
+        <w:t>npm</w:t>
+      </w:r>
+      <w:proofErr w:type="spellEnd"/>
+      <w:r>
+        <w:rPr>
+          <w:b/>
+          <w:bCs/>
+        </w:rPr>
+        <w:t xml:space="preserve"> </w:t>
+      </w:r>
+      <w:proofErr w:type="spellStart"/>
+      <w:r>
+        <w:rPr>
+          <w:b/>
+          <w:bCs/>
+        </w:rPr>
+        <w:t>init</w:t>
+      </w:r>
+      <w:proofErr w:type="spellEnd"/>
       <w:r>
         <w:t xml:space="preserve"> command) </w:t>
       </w:r>
@@ -273,6 +293,7 @@
       <w:r>
         <w:t xml:space="preserve"> this exercise, we will create a new directory called </w:t>
       </w:r>
+      <w:proofErr w:type="spellStart"/>
       <w:r>
         <w:rPr>
           <w:b/>
@@ -294,6 +315,7 @@
         </w:rPr>
         <w:t>pp</w:t>
       </w:r>
+      <w:proofErr w:type="spellEnd"/>
       <w:r>
         <w:rPr>
           <w:b/>
@@ -412,6 +434,7 @@
                                 <w:szCs w:val="24"/>
                               </w:rPr>
                             </w:pPr>
+                            <w:proofErr w:type="spellStart"/>
                             <w:r>
                               <w:rPr>
                                 <w:b/>
@@ -419,7 +442,27 @@
                                 <w:sz w:val="24"/>
                                 <w:szCs w:val="24"/>
                               </w:rPr>
-                              <w:t>mkdir  docker</w:t>
+                              <w:t>mkdir</w:t>
+                            </w:r>
+                            <w:proofErr w:type="spellEnd"/>
+                            <w:r>
+                              <w:rPr>
+                                <w:b/>
+                                <w:bCs/>
+                                <w:sz w:val="24"/>
+                                <w:szCs w:val="24"/>
+                              </w:rPr>
+                              <w:t xml:space="preserve">  </w:t>
+                            </w:r>
+                            <w:proofErr w:type="spellStart"/>
+                            <w:r>
+                              <w:rPr>
+                                <w:b/>
+                                <w:bCs/>
+                                <w:sz w:val="24"/>
+                                <w:szCs w:val="24"/>
+                              </w:rPr>
+                              <w:t>docker</w:t>
                             </w:r>
                             <w:r>
                               <w:rPr>
@@ -439,6 +482,7 @@
                               </w:rPr>
                               <w:t>pp</w:t>
                             </w:r>
+                            <w:proofErr w:type="spellEnd"/>
                           </w:p>
                           <w:p>
                             <w:pPr>
@@ -456,7 +500,17 @@
                                 <w:sz w:val="24"/>
                                 <w:szCs w:val="24"/>
                               </w:rPr>
-                              <w:t>cd  docker</w:t>
+                              <w:t xml:space="preserve">cd  </w:t>
+                            </w:r>
+                            <w:proofErr w:type="spellStart"/>
+                            <w:r>
+                              <w:rPr>
+                                <w:b/>
+                                <w:bCs/>
+                                <w:sz w:val="24"/>
+                                <w:szCs w:val="24"/>
+                              </w:rPr>
+                              <w:t>docker</w:t>
                             </w:r>
                             <w:r>
                               <w:rPr>
@@ -467,6 +521,7 @@
                               </w:rPr>
                               <w:t>_app</w:t>
                             </w:r>
+                            <w:proofErr w:type="spellEnd"/>
                           </w:p>
                           <w:p>
                             <w:pPr>
@@ -477,6 +532,7 @@
                                 <w:szCs w:val="24"/>
                               </w:rPr>
                             </w:pPr>
+                            <w:proofErr w:type="spellStart"/>
                             <w:r>
                               <w:rPr>
                                 <w:b/>
@@ -484,7 +540,37 @@
                                 <w:sz w:val="24"/>
                                 <w:szCs w:val="24"/>
                               </w:rPr>
-                              <w:t>npm  init  -y</w:t>
+                              <w:t>npm</w:t>
+                            </w:r>
+                            <w:proofErr w:type="spellEnd"/>
+                            <w:r>
+                              <w:rPr>
+                                <w:b/>
+                                <w:bCs/>
+                                <w:sz w:val="24"/>
+                                <w:szCs w:val="24"/>
+                              </w:rPr>
+                              <w:t xml:space="preserve">  </w:t>
+                            </w:r>
+                            <w:proofErr w:type="spellStart"/>
+                            <w:r>
+                              <w:rPr>
+                                <w:b/>
+                                <w:bCs/>
+                                <w:sz w:val="24"/>
+                                <w:szCs w:val="24"/>
+                              </w:rPr>
+                              <w:t>init</w:t>
+                            </w:r>
+                            <w:proofErr w:type="spellEnd"/>
+                            <w:r>
+                              <w:rPr>
+                                <w:b/>
+                                <w:bCs/>
+                                <w:sz w:val="24"/>
+                                <w:szCs w:val="24"/>
+                              </w:rPr>
+                              <w:t xml:space="preserve">  -y</w:t>
                             </w:r>
                           </w:p>
                           <w:p>
@@ -813,6 +899,7 @@
           <w:lang w:eastAsia="en-GB" w:bidi="yi-Hebr"/>
         </w:rPr>
       </w:pPr>
+      <w:proofErr w:type="spellStart"/>
       <w:r>
         <w:rPr>
           <w:rFonts w:ascii="Consolas" w:eastAsia="Times New Roman" w:hAnsi="Consolas" w:cs="Times New Roman"/>
@@ -825,6 +912,7 @@
         </w:rPr>
         <w:t>const</w:t>
       </w:r>
+      <w:proofErr w:type="spellEnd"/>
       <w:r>
         <w:rPr>
           <w:rFonts w:ascii="Consolas" w:eastAsia="Times New Roman" w:hAnsi="Consolas" w:cs="Times New Roman"/>
@@ -847,8 +935,22 @@
           <w:szCs w:val="21"/>
           <w:lang w:eastAsia="en-GB" w:bidi="yi-Hebr"/>
         </w:rPr>
-        <w:t>'express'</w:t>
-      </w:r>
+        <w:t>'</w:t>
+      </w:r>
+      <w:proofErr w:type="spellStart"/>
+      <w:r>
+        <w:rPr>
+          <w:rFonts w:ascii="Consolas" w:eastAsia="Times New Roman" w:hAnsi="Consolas" w:cs="Times New Roman"/>
+          <w:b/>
+          <w:bCs/>
+          <w:color w:val="A31515"/>
+          <w:sz w:val="21"/>
+          <w:szCs w:val="21"/>
+          <w:lang w:eastAsia="en-GB" w:bidi="yi-Hebr"/>
+        </w:rPr>
+        <w:t>express'</w:t>
+      </w:r>
+      <w:proofErr w:type="spellEnd"/>
       <w:r>
         <w:rPr>
           <w:rFonts w:ascii="Consolas" w:eastAsia="Times New Roman" w:hAnsi="Consolas" w:cs="Times New Roman"/>
@@ -909,6 +1011,7 @@
           <w:lang w:eastAsia="en-GB" w:bidi="yi-Hebr"/>
         </w:rPr>
       </w:pPr>
+      <w:proofErr w:type="spellStart"/>
       <w:r>
         <w:rPr>
           <w:rFonts w:ascii="Consolas" w:eastAsia="Times New Roman" w:hAnsi="Consolas" w:cs="Times New Roman"/>
@@ -921,6 +1024,7 @@
         </w:rPr>
         <w:t>const</w:t>
       </w:r>
+      <w:proofErr w:type="spellEnd"/>
       <w:r>
         <w:rPr>
           <w:rFonts w:ascii="Consolas" w:eastAsia="Times New Roman" w:hAnsi="Consolas" w:cs="Times New Roman"/>
@@ -981,6 +1085,7 @@
           <w:lang w:eastAsia="en-GB" w:bidi="yi-Hebr"/>
         </w:rPr>
       </w:pPr>
+      <w:proofErr w:type="spellStart"/>
       <w:r>
         <w:rPr>
           <w:rFonts w:ascii="Consolas" w:eastAsia="Times New Roman" w:hAnsi="Consolas" w:cs="Times New Roman"/>
@@ -993,6 +1098,7 @@
         </w:rPr>
         <w:t>const</w:t>
       </w:r>
+      <w:proofErr w:type="spellEnd"/>
       <w:r>
         <w:rPr>
           <w:rFonts w:ascii="Consolas" w:eastAsia="Times New Roman" w:hAnsi="Consolas" w:cs="Times New Roman"/>
@@ -1089,6 +1195,7 @@
           <w:lang w:eastAsia="en-GB" w:bidi="yi-Hebr"/>
         </w:rPr>
       </w:pPr>
+      <w:proofErr w:type="spellStart"/>
       <w:r>
         <w:rPr>
           <w:rFonts w:ascii="Consolas" w:eastAsia="Times New Roman" w:hAnsi="Consolas" w:cs="Times New Roman"/>
@@ -1101,6 +1208,7 @@
         </w:rPr>
         <w:t>const</w:t>
       </w:r>
+      <w:proofErr w:type="spellEnd"/>
       <w:r>
         <w:rPr>
           <w:rFonts w:ascii="Consolas" w:eastAsia="Times New Roman" w:hAnsi="Consolas" w:cs="Times New Roman"/>
@@ -1137,17 +1245,31 @@
           <w:lang w:eastAsia="en-GB" w:bidi="yi-Hebr"/>
         </w:rPr>
       </w:pPr>
-      <w:r>
-        <w:rPr>
-          <w:rFonts w:ascii="Consolas" w:eastAsia="Times New Roman" w:hAnsi="Consolas" w:cs="Times New Roman"/>
-          <w:b/>
-          <w:bCs/>
-          <w:color w:val="000000"/>
-          <w:sz w:val="21"/>
-          <w:szCs w:val="21"/>
-          <w:lang w:eastAsia="en-GB" w:bidi="yi-Hebr"/>
-        </w:rPr>
-        <w:t>app.get(</w:t>
+      <w:proofErr w:type="spellStart"/>
+      <w:r>
+        <w:rPr>
+          <w:rFonts w:ascii="Consolas" w:eastAsia="Times New Roman" w:hAnsi="Consolas" w:cs="Times New Roman"/>
+          <w:b/>
+          <w:bCs/>
+          <w:color w:val="000000"/>
+          <w:sz w:val="21"/>
+          <w:szCs w:val="21"/>
+          <w:lang w:eastAsia="en-GB" w:bidi="yi-Hebr"/>
+        </w:rPr>
+        <w:t>app.get</w:t>
+      </w:r>
+      <w:proofErr w:type="spellEnd"/>
+      <w:r>
+        <w:rPr>
+          <w:rFonts w:ascii="Consolas" w:eastAsia="Times New Roman" w:hAnsi="Consolas" w:cs="Times New Roman"/>
+          <w:b/>
+          <w:bCs/>
+          <w:color w:val="000000"/>
+          <w:sz w:val="21"/>
+          <w:szCs w:val="21"/>
+          <w:lang w:eastAsia="en-GB" w:bidi="yi-Hebr"/>
+        </w:rPr>
+        <w:t>(</w:t>
       </w:r>
       <w:r>
         <w:rPr>
@@ -1171,7 +1293,33 @@
           <w:szCs w:val="21"/>
           <w:lang w:eastAsia="en-GB" w:bidi="yi-Hebr"/>
         </w:rPr>
-        <w:t xml:space="preserve">, (req, res) </w:t>
+        <w:t>, (</w:t>
+      </w:r>
+      <w:proofErr w:type="spellStart"/>
+      <w:r>
+        <w:rPr>
+          <w:rFonts w:ascii="Consolas" w:eastAsia="Times New Roman" w:hAnsi="Consolas" w:cs="Times New Roman"/>
+          <w:b/>
+          <w:bCs/>
+          <w:color w:val="000000"/>
+          <w:sz w:val="21"/>
+          <w:szCs w:val="21"/>
+          <w:lang w:eastAsia="en-GB" w:bidi="yi-Hebr"/>
+        </w:rPr>
+        <w:t>req</w:t>
+      </w:r>
+      <w:proofErr w:type="spellEnd"/>
+      <w:r>
+        <w:rPr>
+          <w:rFonts w:ascii="Consolas" w:eastAsia="Times New Roman" w:hAnsi="Consolas" w:cs="Times New Roman"/>
+          <w:b/>
+          <w:bCs/>
+          <w:color w:val="000000"/>
+          <w:sz w:val="21"/>
+          <w:szCs w:val="21"/>
+          <w:lang w:eastAsia="en-GB" w:bidi="yi-Hebr"/>
+        </w:rPr>
+        <w:t xml:space="preserve">, res) </w:t>
       </w:r>
       <w:r>
         <w:rPr>
@@ -1231,7 +1379,33 @@
           <w:szCs w:val="21"/>
           <w:lang w:eastAsia="en-GB" w:bidi="yi-Hebr"/>
         </w:rPr>
-        <w:t>  res.send(</w:t>
+        <w:t xml:space="preserve">  </w:t>
+      </w:r>
+      <w:proofErr w:type="spellStart"/>
+      <w:r>
+        <w:rPr>
+          <w:rFonts w:ascii="Consolas" w:eastAsia="Times New Roman" w:hAnsi="Consolas" w:cs="Times New Roman"/>
+          <w:b/>
+          <w:bCs/>
+          <w:color w:val="000000"/>
+          <w:sz w:val="21"/>
+          <w:szCs w:val="21"/>
+          <w:lang w:eastAsia="en-GB" w:bidi="yi-Hebr"/>
+        </w:rPr>
+        <w:t>res.send</w:t>
+      </w:r>
+      <w:proofErr w:type="spellEnd"/>
+      <w:r>
+        <w:rPr>
+          <w:rFonts w:ascii="Consolas" w:eastAsia="Times New Roman" w:hAnsi="Consolas" w:cs="Times New Roman"/>
+          <w:b/>
+          <w:bCs/>
+          <w:color w:val="000000"/>
+          <w:sz w:val="21"/>
+          <w:szCs w:val="21"/>
+          <w:lang w:eastAsia="en-GB" w:bidi="yi-Hebr"/>
+        </w:rPr>
+        <w:t>(</w:t>
       </w:r>
       <w:r>
         <w:rPr>
@@ -1401,17 +1575,31 @@
           <w:lang w:eastAsia="en-GB" w:bidi="yi-Hebr"/>
         </w:rPr>
       </w:pPr>
-      <w:r>
-        <w:rPr>
-          <w:rFonts w:ascii="Consolas" w:eastAsia="Times New Roman" w:hAnsi="Consolas" w:cs="Times New Roman"/>
-          <w:b/>
-          <w:bCs/>
-          <w:color w:val="000000"/>
-          <w:sz w:val="21"/>
-          <w:szCs w:val="21"/>
-          <w:lang w:eastAsia="en-GB" w:bidi="yi-Hebr"/>
-        </w:rPr>
-        <w:t xml:space="preserve">app.listen(PORT, HOST, () </w:t>
+      <w:proofErr w:type="spellStart"/>
+      <w:r>
+        <w:rPr>
+          <w:rFonts w:ascii="Consolas" w:eastAsia="Times New Roman" w:hAnsi="Consolas" w:cs="Times New Roman"/>
+          <w:b/>
+          <w:bCs/>
+          <w:color w:val="000000"/>
+          <w:sz w:val="21"/>
+          <w:szCs w:val="21"/>
+          <w:lang w:eastAsia="en-GB" w:bidi="yi-Hebr"/>
+        </w:rPr>
+        <w:t>app.listen</w:t>
+      </w:r>
+      <w:proofErr w:type="spellEnd"/>
+      <w:r>
+        <w:rPr>
+          <w:rFonts w:ascii="Consolas" w:eastAsia="Times New Roman" w:hAnsi="Consolas" w:cs="Times New Roman"/>
+          <w:b/>
+          <w:bCs/>
+          <w:color w:val="000000"/>
+          <w:sz w:val="21"/>
+          <w:szCs w:val="21"/>
+          <w:lang w:eastAsia="en-GB" w:bidi="yi-Hebr"/>
+        </w:rPr>
+        <w:t xml:space="preserve">(PORT, HOST, () </w:t>
       </w:r>
       <w:r>
         <w:rPr>
@@ -1683,6 +1871,7 @@
       <w:r>
         <w:t xml:space="preserve"> </w:t>
       </w:r>
+      <w:proofErr w:type="spellStart"/>
       <w:r>
         <w:rPr>
           <w:b/>
@@ -1692,6 +1881,7 @@
         </w:rPr>
         <w:t>package.json</w:t>
       </w:r>
+      <w:proofErr w:type="spellEnd"/>
       <w:r>
         <w:rPr>
           <w:sz w:val="24"/>
@@ -1814,8 +2004,9 @@
           <w:szCs w:val="21"/>
           <w:lang w:eastAsia="en-GB" w:bidi="yi-Hebr"/>
         </w:rPr>
-        <w:t>"qa_</w:t>
-      </w:r>
+        <w:t>"</w:t>
+      </w:r>
+      <w:proofErr w:type="spellStart"/>
       <w:r>
         <w:rPr>
           <w:rFonts w:ascii="Consolas" w:eastAsia="Times New Roman" w:hAnsi="Consolas" w:cs="Times New Roman"/>
@@ -1826,6 +2017,18 @@
           <w:szCs w:val="21"/>
           <w:lang w:eastAsia="en-GB" w:bidi="yi-Hebr"/>
         </w:rPr>
+        <w:t>qa_</w:t>
+      </w:r>
+      <w:r>
+        <w:rPr>
+          <w:rFonts w:ascii="Consolas" w:eastAsia="Times New Roman" w:hAnsi="Consolas" w:cs="Times New Roman"/>
+          <w:b/>
+          <w:bCs/>
+          <w:color w:val="A31515"/>
+          <w:sz w:val="21"/>
+          <w:szCs w:val="21"/>
+          <w:lang w:eastAsia="en-GB" w:bidi="yi-Hebr"/>
+        </w:rPr>
         <w:t>node</w:t>
       </w:r>
       <w:r>
@@ -1838,7 +2041,20 @@
           <w:szCs w:val="21"/>
           <w:lang w:eastAsia="en-GB" w:bidi="yi-Hebr"/>
         </w:rPr>
-        <w:t>_app"</w:t>
+        <w:t>_app</w:t>
+      </w:r>
+      <w:proofErr w:type="spellEnd"/>
+      <w:r>
+        <w:rPr>
+          <w:rFonts w:ascii="Consolas" w:eastAsia="Times New Roman" w:hAnsi="Consolas" w:cs="Times New Roman"/>
+          <w:b/>
+          <w:bCs/>
+          <w:color w:val="A31515"/>
+          <w:sz w:val="21"/>
+          <w:szCs w:val="21"/>
+          <w:lang w:eastAsia="en-GB" w:bidi="yi-Hebr"/>
+        </w:rPr>
+        <w:t>"</w:t>
       </w:r>
       <w:r>
         <w:rPr>
@@ -2628,6 +2844,7 @@
       <w:r>
         <w:br/>
       </w:r>
+      <w:proofErr w:type="spellStart"/>
       <w:r>
         <w:rPr>
           <w:b/>
@@ -2638,6 +2855,7 @@
         </w:rPr>
         <w:t>npm</w:t>
       </w:r>
+      <w:proofErr w:type="spellEnd"/>
       <w:r>
         <w:rPr>
           <w:b/>
@@ -2680,6 +2898,7 @@
       <w:r>
         <w:t xml:space="preserve">Start running your node app to see if it works by typing: </w:t>
       </w:r>
+      <w:proofErr w:type="spellStart"/>
       <w:r>
         <w:rPr>
           <w:b/>
@@ -2688,7 +2907,18 @@
           <w:sz w:val="28"/>
           <w:szCs w:val="28"/>
         </w:rPr>
-        <w:t>npm start</w:t>
+        <w:t>npm</w:t>
+      </w:r>
+      <w:proofErr w:type="spellEnd"/>
+      <w:r>
+        <w:rPr>
+          <w:b/>
+          <w:bCs/>
+          <w:color w:val="2F5496" w:themeColor="accent1" w:themeShade="BF"/>
+          <w:sz w:val="28"/>
+          <w:szCs w:val="28"/>
+        </w:rPr>
+        <w:t xml:space="preserve"> start</w:t>
       </w:r>
     </w:p>
     <w:p>
@@ -2838,7 +3068,23 @@
           <w:b/>
           <w:bCs/>
         </w:rPr>
-        <w:t xml:space="preserve">Create a Dockerfile: </w:t>
+        <w:t xml:space="preserve">Create a </w:t>
+      </w:r>
+      <w:proofErr w:type="spellStart"/>
+      <w:r>
+        <w:rPr>
+          <w:b/>
+          <w:bCs/>
+        </w:rPr>
+        <w:t>Dockerfile</w:t>
+      </w:r>
+      <w:proofErr w:type="spellEnd"/>
+      <w:r>
+        <w:rPr>
+          <w:b/>
+          <w:bCs/>
+        </w:rPr>
+        <w:t xml:space="preserve">: </w:t>
       </w:r>
     </w:p>
     <w:p>
@@ -2846,7 +3092,15 @@
         <w:t>In this part, you will c</w:t>
       </w:r>
       <w:r>
-        <w:t xml:space="preserve">reate a Dockerfile that will be used to build a Docker image </w:t>
+        <w:t xml:space="preserve">reate a </w:t>
+      </w:r>
+      <w:proofErr w:type="spellStart"/>
+      <w:r>
+        <w:t>Dockerfile</w:t>
+      </w:r>
+      <w:proofErr w:type="spellEnd"/>
+      <w:r>
+        <w:t xml:space="preserve"> that will be used to build a Docker image </w:t>
       </w:r>
       <w:r>
         <w:t>for</w:t>
@@ -2873,6 +3127,7 @@
       <w:r>
         <w:t xml:space="preserve">file called </w:t>
       </w:r>
+      <w:proofErr w:type="spellStart"/>
       <w:r>
         <w:rPr>
           <w:b/>
@@ -2880,6 +3135,7 @@
         </w:rPr>
         <w:t>Dockerfile</w:t>
       </w:r>
+      <w:proofErr w:type="spellEnd"/>
       <w:r>
         <w:t xml:space="preserve"> </w:t>
       </w:r>
@@ -3077,7 +3333,33 @@
           <w:szCs w:val="21"/>
           <w:lang w:eastAsia="en-GB" w:bidi="yi-Hebr"/>
         </w:rPr>
-        <w:t xml:space="preserve"> /usr/src/app</w:t>
+        <w:t xml:space="preserve"> /</w:t>
+      </w:r>
+      <w:proofErr w:type="spellStart"/>
+      <w:r>
+        <w:rPr>
+          <w:rFonts w:ascii="Consolas" w:eastAsia="Times New Roman" w:hAnsi="Consolas" w:cs="Times New Roman"/>
+          <w:b/>
+          <w:bCs/>
+          <w:color w:val="000000"/>
+          <w:sz w:val="21"/>
+          <w:szCs w:val="21"/>
+          <w:lang w:eastAsia="en-GB" w:bidi="yi-Hebr"/>
+        </w:rPr>
+        <w:t>usr</w:t>
+      </w:r>
+      <w:proofErr w:type="spellEnd"/>
+      <w:r>
+        <w:rPr>
+          <w:rFonts w:ascii="Consolas" w:eastAsia="Times New Roman" w:hAnsi="Consolas" w:cs="Times New Roman"/>
+          <w:b/>
+          <w:bCs/>
+          <w:color w:val="000000"/>
+          <w:sz w:val="21"/>
+          <w:szCs w:val="21"/>
+          <w:lang w:eastAsia="en-GB" w:bidi="yi-Hebr"/>
+        </w:rPr>
+        <w:t>/src/app</w:t>
       </w:r>
     </w:p>
     <w:p>
@@ -3245,7 +3527,59 @@
           <w:szCs w:val="21"/>
           <w:lang w:eastAsia="en-GB" w:bidi="yi-Hebr"/>
         </w:rPr>
-        <w:t xml:space="preserve"> package.json AND package-lock.json </w:t>
+        <w:t xml:space="preserve"> </w:t>
+      </w:r>
+      <w:proofErr w:type="spellStart"/>
+      <w:r>
+        <w:rPr>
+          <w:rFonts w:ascii="Consolas" w:eastAsia="Times New Roman" w:hAnsi="Consolas" w:cs="Times New Roman"/>
+          <w:b/>
+          <w:bCs/>
+          <w:color w:val="008000"/>
+          <w:sz w:val="21"/>
+          <w:szCs w:val="21"/>
+          <w:lang w:eastAsia="en-GB" w:bidi="yi-Hebr"/>
+        </w:rPr>
+        <w:t>package.json</w:t>
+      </w:r>
+      <w:proofErr w:type="spellEnd"/>
+      <w:r>
+        <w:rPr>
+          <w:rFonts w:ascii="Consolas" w:eastAsia="Times New Roman" w:hAnsi="Consolas" w:cs="Times New Roman"/>
+          <w:b/>
+          <w:bCs/>
+          <w:color w:val="008000"/>
+          <w:sz w:val="21"/>
+          <w:szCs w:val="21"/>
+          <w:lang w:eastAsia="en-GB" w:bidi="yi-Hebr"/>
+        </w:rPr>
+        <w:t xml:space="preserve"> AND package-</w:t>
+      </w:r>
+      <w:proofErr w:type="spellStart"/>
+      <w:r>
+        <w:rPr>
+          <w:rFonts w:ascii="Consolas" w:eastAsia="Times New Roman" w:hAnsi="Consolas" w:cs="Times New Roman"/>
+          <w:b/>
+          <w:bCs/>
+          <w:color w:val="008000"/>
+          <w:sz w:val="21"/>
+          <w:szCs w:val="21"/>
+          <w:lang w:eastAsia="en-GB" w:bidi="yi-Hebr"/>
+        </w:rPr>
+        <w:t>lock.json</w:t>
+      </w:r>
+      <w:proofErr w:type="spellEnd"/>
+      <w:r>
+        <w:rPr>
+          <w:rFonts w:ascii="Consolas" w:eastAsia="Times New Roman" w:hAnsi="Consolas" w:cs="Times New Roman"/>
+          <w:b/>
+          <w:bCs/>
+          <w:color w:val="008000"/>
+          <w:sz w:val="21"/>
+          <w:szCs w:val="21"/>
+          <w:lang w:eastAsia="en-GB" w:bidi="yi-Hebr"/>
+        </w:rPr>
+        <w:t xml:space="preserve"> </w:t>
       </w:r>
     </w:p>
     <w:p>
@@ -3293,7 +3627,33 @@
           <w:szCs w:val="21"/>
           <w:lang w:eastAsia="en-GB" w:bidi="yi-Hebr"/>
         </w:rPr>
-        <w:t xml:space="preserve"> package*.json ./</w:t>
+        <w:t xml:space="preserve"> package*.</w:t>
+      </w:r>
+      <w:proofErr w:type="spellStart"/>
+      <w:r>
+        <w:rPr>
+          <w:rFonts w:ascii="Consolas" w:eastAsia="Times New Roman" w:hAnsi="Consolas" w:cs="Times New Roman"/>
+          <w:b/>
+          <w:bCs/>
+          <w:color w:val="000000"/>
+          <w:sz w:val="21"/>
+          <w:szCs w:val="21"/>
+          <w:lang w:eastAsia="en-GB" w:bidi="yi-Hebr"/>
+        </w:rPr>
+        <w:t>json</w:t>
+      </w:r>
+      <w:proofErr w:type="spellEnd"/>
+      <w:r>
+        <w:rPr>
+          <w:rFonts w:ascii="Consolas" w:eastAsia="Times New Roman" w:hAnsi="Consolas" w:cs="Times New Roman"/>
+          <w:b/>
+          <w:bCs/>
+          <w:color w:val="000000"/>
+          <w:sz w:val="21"/>
+          <w:szCs w:val="21"/>
+          <w:lang w:eastAsia="en-GB" w:bidi="yi-Hebr"/>
+        </w:rPr>
+        <w:t xml:space="preserve"> ./</w:t>
       </w:r>
     </w:p>
     <w:p>
@@ -3365,7 +3725,33 @@
           <w:szCs w:val="21"/>
           <w:lang w:eastAsia="en-GB" w:bidi="yi-Hebr"/>
         </w:rPr>
-        <w:t xml:space="preserve"> npm install</w:t>
+        <w:t xml:space="preserve"> </w:t>
+      </w:r>
+      <w:proofErr w:type="spellStart"/>
+      <w:r>
+        <w:rPr>
+          <w:rFonts w:ascii="Consolas" w:eastAsia="Times New Roman" w:hAnsi="Consolas" w:cs="Times New Roman"/>
+          <w:b/>
+          <w:bCs/>
+          <w:color w:val="000000"/>
+          <w:sz w:val="21"/>
+          <w:szCs w:val="21"/>
+          <w:lang w:eastAsia="en-GB" w:bidi="yi-Hebr"/>
+        </w:rPr>
+        <w:t>npm</w:t>
+      </w:r>
+      <w:proofErr w:type="spellEnd"/>
+      <w:r>
+        <w:rPr>
+          <w:rFonts w:ascii="Consolas" w:eastAsia="Times New Roman" w:hAnsi="Consolas" w:cs="Times New Roman"/>
+          <w:b/>
+          <w:bCs/>
+          <w:color w:val="000000"/>
+          <w:sz w:val="21"/>
+          <w:szCs w:val="21"/>
+          <w:lang w:eastAsia="en-GB" w:bidi="yi-Hebr"/>
+        </w:rPr>
+        <w:t xml:space="preserve"> install</w:t>
       </w:r>
     </w:p>
     <w:p>
@@ -3739,16 +4125,43 @@
           <w:sz w:val="24"/>
           <w:szCs w:val="24"/>
         </w:rPr>
-        <w:t>.dockerignore</w:t>
-      </w:r>
+        <w:t>.</w:t>
+      </w:r>
+      <w:proofErr w:type="spellStart"/>
+      <w:r>
+        <w:rPr>
+          <w:b/>
+          <w:bCs/>
+          <w:sz w:val="24"/>
+          <w:szCs w:val="24"/>
+        </w:rPr>
+        <w:t>dockerignore</w:t>
+      </w:r>
+      <w:proofErr w:type="spellEnd"/>
       <w:r>
         <w:t xml:space="preserve"> </w:t>
       </w:r>
       <w:r>
-        <w:t xml:space="preserve">(dot dockerignore) </w:t>
-      </w:r>
-      <w:r>
-        <w:t xml:space="preserve">file in the same directory as your Dockerfile with </w:t>
+        <w:t xml:space="preserve">(dot </w:t>
+      </w:r>
+      <w:proofErr w:type="spellStart"/>
+      <w:r>
+        <w:t>dockerignore</w:t>
+      </w:r>
+      <w:proofErr w:type="spellEnd"/>
+      <w:r>
+        <w:t xml:space="preserve">) </w:t>
+      </w:r>
+      <w:r>
+        <w:t xml:space="preserve">file in the same directory as your </w:t>
+      </w:r>
+      <w:proofErr w:type="spellStart"/>
+      <w:r>
+        <w:t>Dockerfile</w:t>
+      </w:r>
+      <w:proofErr w:type="spellEnd"/>
+      <w:r>
+        <w:t xml:space="preserve"> with </w:t>
       </w:r>
       <w:r>
         <w:t xml:space="preserve">the </w:t>
@@ -3778,6 +4191,7 @@
           <w:lang w:eastAsia="en-GB" w:bidi="yi-Hebr"/>
         </w:rPr>
       </w:pPr>
+      <w:proofErr w:type="spellStart"/>
       <w:r>
         <w:rPr>
           <w:rFonts w:ascii="Consolas" w:eastAsia="Times New Roman" w:hAnsi="Consolas" w:cs="Times New Roman"/>
@@ -3790,6 +4204,7 @@
         </w:rPr>
         <w:t>node_modules</w:t>
       </w:r>
+      <w:proofErr w:type="spellEnd"/>
     </w:p>
     <w:p>
       <w:pPr>
@@ -3879,10 +4294,44 @@
           <w:szCs w:val="21"/>
           <w:lang w:eastAsia="en-GB" w:bidi="yi-Hebr"/>
         </w:rPr>
-        <w:t xml:space="preserve"> npm install</w:t>
-      </w:r>
-      <w:r>
-        <w:t xml:space="preserve">  in the Dockerfile.</w:t>
+        <w:t xml:space="preserve"> </w:t>
+      </w:r>
+      <w:proofErr w:type="spellStart"/>
+      <w:r>
+        <w:rPr>
+          <w:rFonts w:ascii="Consolas" w:eastAsia="Times New Roman" w:hAnsi="Consolas" w:cs="Times New Roman"/>
+          <w:b/>
+          <w:bCs/>
+          <w:color w:val="000000"/>
+          <w:sz w:val="21"/>
+          <w:szCs w:val="21"/>
+          <w:lang w:eastAsia="en-GB" w:bidi="yi-Hebr"/>
+        </w:rPr>
+        <w:t>npm</w:t>
+      </w:r>
+      <w:proofErr w:type="spellEnd"/>
+      <w:r>
+        <w:rPr>
+          <w:rFonts w:ascii="Consolas" w:eastAsia="Times New Roman" w:hAnsi="Consolas" w:cs="Times New Roman"/>
+          <w:b/>
+          <w:bCs/>
+          <w:color w:val="000000"/>
+          <w:sz w:val="21"/>
+          <w:szCs w:val="21"/>
+          <w:lang w:eastAsia="en-GB" w:bidi="yi-Hebr"/>
+        </w:rPr>
+        <w:t xml:space="preserve"> install</w:t>
+      </w:r>
+      <w:r>
+        <w:t xml:space="preserve">  in the </w:t>
+      </w:r>
+      <w:proofErr w:type="spellStart"/>
+      <w:r>
+        <w:t>Dockerfile</w:t>
+      </w:r>
+      <w:proofErr w:type="spellEnd"/>
+      <w:r>
+        <w:t>.</w:t>
       </w:r>
     </w:p>
     <w:p/>
@@ -3939,7 +4388,23 @@
           <w:b/>
           <w:bCs/>
         </w:rPr>
-        <w:t>mike/qa-</w:t>
+        <w:t>mike/</w:t>
+      </w:r>
+      <w:proofErr w:type="spellStart"/>
+      <w:r>
+        <w:rPr>
+          <w:b/>
+          <w:bCs/>
+        </w:rPr>
+        <w:t>qa</w:t>
+      </w:r>
+      <w:proofErr w:type="spellEnd"/>
+      <w:r>
+        <w:rPr>
+          <w:b/>
+          <w:bCs/>
+        </w:rPr>
+        <w:t>-</w:t>
       </w:r>
       <w:r>
         <w:rPr>
@@ -4015,8 +4480,9 @@
           <w:sz w:val="28"/>
           <w:szCs w:val="28"/>
         </w:rPr>
-        <w:t>mike/qa-</w:t>
-      </w:r>
+        <w:t>mike/</w:t>
+      </w:r>
+      <w:proofErr w:type="spellStart"/>
       <w:r>
         <w:rPr>
           <w:b/>
@@ -4024,7 +4490,7 @@
           <w:sz w:val="28"/>
           <w:szCs w:val="28"/>
         </w:rPr>
-        <w:t>node</w:t>
+        <w:t>qa</w:t>
       </w:r>
       <w:r>
         <w:rPr>
@@ -4033,8 +4499,36 @@
           <w:sz w:val="28"/>
           <w:szCs w:val="28"/>
         </w:rPr>
-        <w:t>-app</w:t>
-      </w:r>
+        <w:t>_</w:t>
+      </w:r>
+      <w:r>
+        <w:rPr>
+          <w:b/>
+          <w:bCs/>
+          <w:sz w:val="28"/>
+          <w:szCs w:val="28"/>
+        </w:rPr>
+        <w:t>node</w:t>
+      </w:r>
+      <w:r>
+        <w:rPr>
+          <w:b/>
+          <w:bCs/>
+          <w:sz w:val="28"/>
+          <w:szCs w:val="28"/>
+        </w:rPr>
+        <w:t>_</w:t>
+      </w:r>
+      <w:r>
+        <w:rPr>
+          <w:b/>
+          <w:bCs/>
+          <w:sz w:val="28"/>
+          <w:szCs w:val="28"/>
+        </w:rPr>
+        <w:t>app</w:t>
+      </w:r>
+      <w:proofErr w:type="spellEnd"/>
     </w:p>
     <w:p>
       <w:pPr>
@@ -4070,7 +4564,15 @@
       </w:r>
       <w:r>
         <w:lastRenderedPageBreak/>
-        <w:t>This command will use the Dockerfile to build a Docker image of your Node.js application and tag it with the name that you specify.</w:t>
+        <w:t xml:space="preserve">This command will use the </w:t>
+      </w:r>
+      <w:proofErr w:type="spellStart"/>
+      <w:r>
+        <w:t>Dockerfile</w:t>
+      </w:r>
+      <w:proofErr w:type="spellEnd"/>
+      <w:r>
+        <w:t xml:space="preserve"> to build a Docker image of your Node.js application and tag it with the name that you specify.</w:t>
       </w:r>
     </w:p>
     <w:p>
@@ -4210,8 +4712,55 @@
           <w:sz w:val="24"/>
           <w:szCs w:val="24"/>
         </w:rPr>
-        <w:t>mike/qa-node-app</w:t>
-      </w:r>
+        <w:t>mike/</w:t>
+      </w:r>
+      <w:proofErr w:type="spellStart"/>
+      <w:r>
+        <w:rPr>
+          <w:b/>
+          <w:bCs/>
+          <w:sz w:val="24"/>
+          <w:szCs w:val="24"/>
+        </w:rPr>
+        <w:t>qa</w:t>
+      </w:r>
+      <w:r>
+        <w:rPr>
+          <w:b/>
+          <w:bCs/>
+          <w:sz w:val="24"/>
+          <w:szCs w:val="24"/>
+        </w:rPr>
+        <w:t>_</w:t>
+      </w:r>
+      <w:r>
+        <w:rPr>
+          <w:b/>
+          <w:bCs/>
+          <w:sz w:val="24"/>
+          <w:szCs w:val="24"/>
+        </w:rPr>
+        <w:t>node</w:t>
+      </w:r>
+      <w:r>
+        <w:rPr>
+          <w:b/>
+          <w:bCs/>
+          <w:sz w:val="24"/>
+          <w:szCs w:val="24"/>
+        </w:rPr>
+        <w:t>_</w:t>
+      </w:r>
+      <w:r>
+        <w:rPr>
+          <w:b/>
+          <w:bCs/>
+          <w:sz w:val="24"/>
+          <w:szCs w:val="24"/>
+        </w:rPr>
+        <w:t>app</w:t>
+      </w:r>
+      <w:proofErr w:type="spellEnd"/>
       <w:r>
         <w:rPr>
           <w:b/>

</xml_diff>

<commit_message>
corrected Jenkins Agent 50000 by removing it as it is not needed
</commit_message>
<xml_diff>
--- a/2-Dockers/2-Dockerizing a Node app Using DockerFile.docx
+++ b/2-Dockers/2-Dockerizing a Node app Using DockerFile.docx
@@ -10,6 +10,13 @@
           <w:bCs/>
         </w:rPr>
       </w:pPr>
+      <w:r>
+        <w:rPr>
+          <w:b/>
+          <w:bCs/>
+        </w:rPr>
+        <w:t xml:space="preserve"> </w:t>
+      </w:r>
       <w:r>
         <w:rPr>
           <w:b/>
@@ -434,7 +441,6 @@
                                 <w:szCs w:val="24"/>
                               </w:rPr>
                             </w:pPr>
-                            <w:proofErr w:type="spellStart"/>
                             <w:r>
                               <w:rPr>
                                 <w:b/>
@@ -442,27 +448,7 @@
                                 <w:sz w:val="24"/>
                                 <w:szCs w:val="24"/>
                               </w:rPr>
-                              <w:t>mkdir</w:t>
-                            </w:r>
-                            <w:proofErr w:type="spellEnd"/>
-                            <w:r>
-                              <w:rPr>
-                                <w:b/>
-                                <w:bCs/>
-                                <w:sz w:val="24"/>
-                                <w:szCs w:val="24"/>
-                              </w:rPr>
-                              <w:t xml:space="preserve">  </w:t>
-                            </w:r>
-                            <w:proofErr w:type="spellStart"/>
-                            <w:r>
-                              <w:rPr>
-                                <w:b/>
-                                <w:bCs/>
-                                <w:sz w:val="24"/>
-                                <w:szCs w:val="24"/>
-                              </w:rPr>
-                              <w:t>docker</w:t>
+                              <w:t>mkdir  docker</w:t>
                             </w:r>
                             <w:r>
                               <w:rPr>
@@ -482,7 +468,6 @@
                               </w:rPr>
                               <w:t>pp</w:t>
                             </w:r>
-                            <w:proofErr w:type="spellEnd"/>
                           </w:p>
                           <w:p>
                             <w:pPr>
@@ -500,17 +485,7 @@
                                 <w:sz w:val="24"/>
                                 <w:szCs w:val="24"/>
                               </w:rPr>
-                              <w:t xml:space="preserve">cd  </w:t>
-                            </w:r>
-                            <w:proofErr w:type="spellStart"/>
-                            <w:r>
-                              <w:rPr>
-                                <w:b/>
-                                <w:bCs/>
-                                <w:sz w:val="24"/>
-                                <w:szCs w:val="24"/>
-                              </w:rPr>
-                              <w:t>docker</w:t>
+                              <w:t>cd  docker</w:t>
                             </w:r>
                             <w:r>
                               <w:rPr>
@@ -521,7 +496,6 @@
                               </w:rPr>
                               <w:t>_app</w:t>
                             </w:r>
-                            <w:proofErr w:type="spellEnd"/>
                           </w:p>
                           <w:p>
                             <w:pPr>
@@ -532,7 +506,6 @@
                                 <w:szCs w:val="24"/>
                               </w:rPr>
                             </w:pPr>
-                            <w:proofErr w:type="spellStart"/>
                             <w:r>
                               <w:rPr>
                                 <w:b/>
@@ -540,37 +513,7 @@
                                 <w:sz w:val="24"/>
                                 <w:szCs w:val="24"/>
                               </w:rPr>
-                              <w:t>npm</w:t>
-                            </w:r>
-                            <w:proofErr w:type="spellEnd"/>
-                            <w:r>
-                              <w:rPr>
-                                <w:b/>
-                                <w:bCs/>
-                                <w:sz w:val="24"/>
-                                <w:szCs w:val="24"/>
-                              </w:rPr>
-                              <w:t xml:space="preserve">  </w:t>
-                            </w:r>
-                            <w:proofErr w:type="spellStart"/>
-                            <w:r>
-                              <w:rPr>
-                                <w:b/>
-                                <w:bCs/>
-                                <w:sz w:val="24"/>
-                                <w:szCs w:val="24"/>
-                              </w:rPr>
-                              <w:t>init</w:t>
-                            </w:r>
-                            <w:proofErr w:type="spellEnd"/>
-                            <w:r>
-                              <w:rPr>
-                                <w:b/>
-                                <w:bCs/>
-                                <w:sz w:val="24"/>
-                                <w:szCs w:val="24"/>
-                              </w:rPr>
-                              <w:t xml:space="preserve">  -y</w:t>
+                              <w:t>npm  init  -y</w:t>
                             </w:r>
                           </w:p>
                           <w:p>
@@ -4440,11 +4383,31 @@
         <w:rPr>
           <w:b/>
           <w:bCs/>
+          <w:color w:val="2F5496" w:themeColor="accent1" w:themeShade="BF"/>
+          <w:sz w:val="28"/>
+          <w:szCs w:val="28"/>
+        </w:rPr>
+        <w:t xml:space="preserve">  </w:t>
+      </w:r>
+      <w:r>
+        <w:rPr>
+          <w:b/>
+          <w:bCs/>
           <w:color w:val="C00000"/>
           <w:sz w:val="36"/>
           <w:szCs w:val="36"/>
         </w:rPr>
         <w:t>.</w:t>
+      </w:r>
+      <w:r>
+        <w:rPr>
+          <w:b/>
+          <w:bCs/>
+          <w:color w:val="C00000"/>
+          <w:sz w:val="36"/>
+          <w:szCs w:val="36"/>
+        </w:rPr>
+        <w:t xml:space="preserve">  </w:t>
       </w:r>
       <w:r>
         <w:rPr>

</xml_diff>